<commit_message>
Retrieval: rebuild with all-MiniLM-L6-v2 and update evaluation
Hugging Face became reachable, so the index now uses sentence-transformers
(384 dims, no fallback). On the 36 paraphrased queries topic P@5 rose from
36.7% (LSA) to 61.7%, exact P@5 32.8% -> 58.3%, MRR 0.374 -> 0.718; two
topics regressed (general help, paid-but-not-delivered). Docs and reports
updated; LSA remains the documented fallback.

Co-Authored-By: Claude Opus 5.5 <noreply@anthropic.com>
Claude-Session: https://claude.ai/code/session_019SpSd1MMjmDUMLzErGWn8Y
</commit_message>
<xml_diff>
--- a/conversation-intelligence-copilot/docs/reports/Conversation_Intelligence_Copilot_Submission_Report.docx
+++ b/conversation-intelligence-copilot/docs/reports/Conversation_Intelligence_Copilot_Submission_Report.docx
@@ -455,7 +455,7 @@
         <w:pStyle w:val="ListBullet"/>
       </w:pPr>
       <w:r>
-        <w:t>Knowledge retrieval: conversation-aware chunks (4 turns, overlap 2), FAISS with metadata filters, one passage per conversation, evidence with message IDs and CSV lines. On 36 paraphrased queries: topic precision@5 36.7% vs 12.5% random (LSA fallback; MiniLM could not be downloaded).</w:t>
+        <w:t>Knowledge retrieval: conversation-aware chunks (4 turns, overlap 2), FAISS with metadata filters, one passage per conversation, evidence with message IDs and CSV lines. On 36 paraphrased queries: topic precision@5 61.7% vs 12.5% random with sentence-transformers/all-MiniLM-L6-v2 (36.7% with the LSA fallback used when the model is unavailable).</w:t>
       </w:r>
     </w:p>
     <w:p>
@@ -622,7 +622,7 @@
           </w:tcPr>
           <w:p>
             <w:r>
-              <w:t>36.7%</w:t>
+              <w:t>61.7%</w:t>
             </w:r>
           </w:p>
         </w:tc>
@@ -644,7 +644,7 @@
           </w:tcPr>
           <w:p>
             <w:r>
-              <w:t>159 / 602 ms</w:t>
+              <w:t>167 / 776 ms</w:t>
             </w:r>
           </w:p>
         </w:tc>
@@ -718,7 +718,7 @@
         <w:pStyle w:val="ListBullet"/>
       </w:pPr>
       <w:r>
-        <w:t>LSA retrieval is weak when queries share no words with the transcripts.</w:t>
+        <w:t>Retrieval still misses some paraphrases (generic help and paid-but-not-delivered queries regressed with MiniLM); the LSA fallback is much weaker.</w:t>
       </w:r>
     </w:p>
     <w:p>

</xml_diff>

<commit_message>
Redesign README with diagrams, charts and screenshots; finish submission deliverables
- README: banner, badges, Mermaid architecture/agent/sequence/routing/memory
  diagrams, light/dark charts with data tables, screenshot gallery; documents
  the local model only, plus a context-only section on how the API would be
  designed with a Gemini key
- readme_figures.py generates the README charts from manifests and DuckDB
- Reports regenerated (Q1 tie, local LLM, retrieval, current test counts)
- Screenshots recaptured; e2e Q1 expectation updated to 240
- make package builds the submission ZIP; audit gains a remediation section

Co-Authored-By: Claude Opus 5.5 <noreply@anthropic.com>
Claude-Session: https://claude.ai/code/session_019SpSd1MMjmDUMLzErGWn8Y
</commit_message>
<xml_diff>
--- a/conversation-intelligence-copilot/docs/reports/Conversation_Intelligence_Copilot_Submission_Report.docx
+++ b/conversation-intelligence-copilot/docs/reports/Conversation_Intelligence_Copilot_Submission_Report.docx
@@ -73,6 +73,22 @@
     </w:p>
     <w:p>
       <w:pPr>
+        <w:pStyle w:val="ListBullet"/>
+      </w:pPr>
+      <w:r>
+        <w:t>Derived rules: a conversation is negative when its customer messages average -0.25 or lower (exact arithmetic at the boundary); leadership priority = 0.30 volume + 0.25 negative rate + 0.15 escalation + 0.15 unresolved + 0.10 resolution misfit + 0.05 trend (min-max scaled).</w:t>
+      </w:r>
+    </w:p>
+    <w:p>
+      <w:pPr>
+        <w:pStyle w:val="ListBullet"/>
+      </w:pPr>
+      <w:r>
+        <w:t>No data was appended. A separate set of 120 generated demo conversations (scripts/generate_synthetic.py, IDs 'S…') exists only for testing the combined mode; it is excluded from the default build and from every reported figure.</w:t>
+      </w:r>
+    </w:p>
+    <w:p>
+      <w:pPr>
         <w:pStyle w:val="Heading1"/>
       </w:pPr>
       <w:r>
@@ -120,7 +136,7 @@
     </w:p>
     <w:p>
       <w:r>
-        <w:t>Input validation → session memory → intent (Gemini structured output, or a deterministic parser) → supervisor/planner (resolves follow-up references and the date window; picks registered operations, one specialist and a retrieval mode) → topic / sentiment / coaching / leadership / analytics agent, in parallel with retrieval when the query is known, or after it when the query depends on the result → evidence assembly → explanation (Gemini, rejected if it contains any number not in the verified results) → visualisation planner → QA agent → governance agent → response → memory and telemetry. Each request is checkpointed; each node emits real start/finish events that the UI and the Agent Harness show.</w:t>
+        <w:t>Input validation → session memory → Zero-LLM router (decides whether a model is needed at all: fact questions, including all four assignment questions, are answered with no model call) → intent (policy rules → high-precision rules → calibrated semantic match → the model, category only, constrained JSON → clarify) → supervisor/planner (resolves follow-up references and the date window; picks registered operations, one specialist and a retrieval mode) → topic / sentiment / coaching / leadership / analytics agent, in parallel with retrieval or after it → evidence assembly → explanation (deterministic, or the model, rejected if it contains any number not in the verified results) → visualisation → QA agent with the Evidence Challenger (quotes re-read from the database, causal wording qualified) → governance → response → memory and telemetry. Agents exchange a typed state; results use one versioned schema (AnalysisResult, ChatResponse). Each request is checkpointed, and each node emits real start/finish events shown in the UI, the Agent Harness and AI Decision Replay.</w:t>
       </w:r>
     </w:p>
     <w:p>
@@ -173,7 +189,7 @@
           </w:tcPr>
           <w:p>
             <w:r>
-              <w:t>Gemini Flash (google-genai)</w:t>
+              <w:t>Optional LLM: local Qwen2.5-1.5B (llama.cpp, no key), Groq, or Gemini</w:t>
             </w:r>
           </w:p>
         </w:tc>
@@ -183,7 +199,7 @@
           </w:tcPr>
           <w:p>
             <w:r>
-              <w:t>Intent, grounded explanation, batch classification; structured JSON with closed enums; rate-limited, retried, cached, circuit-broken; tokens and cost recorded.</w:t>
+              <w:t>Used only when needed: category-only intent classification when rules are unsure, grounded explanation for interpretive questions, optional batch labelling (Gemini). One client interface: constrained JSON, cache, one repair, rate limit, retries, circuit breaker; tokens recorded (unknown, never zero). No key is needed to run the app.</w:t>
             </w:r>
           </w:p>
         </w:tc>
@@ -239,7 +255,7 @@
           </w:tcPr>
           <w:p>
             <w:r>
-              <w:t>FAISS + embeddings</w:t>
+              <w:t>FAISS + MiniLM + LSA</w:t>
             </w:r>
           </w:p>
         </w:tc>
@@ -249,7 +265,7 @@
           </w:tcPr>
           <w:p>
             <w:r>
-              <w:t>Exact cosine search with metadata filters; MiniLM preferred, local LSA fallback.</w:t>
+              <w:t>Two exact-cosine indexes with metadata filters, fused by weighted reciprocal rank fusion (hybrid search).</w:t>
             </w:r>
           </w:p>
         </w:tc>
@@ -313,7 +329,7 @@
     </w:p>
     <w:p>
       <w:r>
-        <w:t>Q1 — Negative topics, November 2025 (latest month in the data): 239 of 682 conversations negative. Top five by count: General help request (49), Duplicate charge (42), Paid but service not delivered (30), Feature not working (28), Login / account locked (24). By rate, Duplicate charge leads; the chi-square p-value (0.0566) shows the differences are not significant at 5%, and the answer says so.</w:t>
+        <w:t>Q1 — Negative topics, November 2025 (latest month in the data): 240 of 682 conversations negative. Top five by count: General help request (49), Duplicate charge (42), Paid but service not delivered (30), Feature not working (28), Login / account locked (24). Rank 5 is a tie: Login / account locked (24 of 58), Coupon not applying (24 of 84) share the same count. The tie-breaker (higher negative rate) lists Login / account locked; the others are equally entitled to the last place. By rate, Duplicate charge leads; the chi-square p-value (0.0707) shows the differences are not significant at 5%, and the answer says so.</w:t>
       </w:r>
     </w:p>
     <w:p>
@@ -400,7 +416,7 @@
     </w:p>
     <w:p>
       <w:r>
-        <w:t>Q4 — Leadership: a documented priority score (volume, negative rate, escalation requests, unresolved endings, resolution misfit, trend). First: Item or service not received (score 67.1); each recommendation names a finding, driver, action, owner, evidence and uncertainty. Sensitivity: Sensitivity: the #1 concern stays #1 in 92% of 13 weight scenarios; mean top-5 overlap 94%.</w:t>
+        <w:t>Q4 — Leadership: a documented priority score (volume, negative rate, escalation requests, unresolved endings, resolution misfit, trend). First: Item or service not received (score 67.1); each recommendation names a finding, driver, action, owner, evidence and uncertainty. Sensitivity: the #1 concern stays #1 in 92% of 13 weight scenarios; mean top-5 overlap 94%.</w:t>
       </w:r>
     </w:p>
     <w:p>
@@ -451,27 +467,139 @@
       </w:r>
     </w:p>
     <w:p>
-      <w:pPr>
-        <w:pStyle w:val="ListBullet"/>
-      </w:pPr>
       <w:r>
-        <w:t>Knowledge retrieval: conversation-aware chunks (4 turns, overlap 2), FAISS with metadata filters, one passage per conversation, evidence with message IDs and CSV lines. On 36 paraphrased queries: topic precision@5 62.2% vs 12.5% random with lsa-tfidf-svd192 + sentence-transformers/all-MiniLM-L6-v2 (36.7% with the LSA fallback used when the model is unavailable).</w:t>
+        <w:rPr>
+          <w:b/>
+        </w:rPr>
+        <w:t>Knowledge retrieval:</w:t>
       </w:r>
     </w:p>
     <w:p>
       <w:pPr>
-        <w:pStyle w:val="ListBullet"/>
+        <w:pStyle w:val="ListBullet2"/>
       </w:pPr>
       <w:r>
-        <w:t>Specialised LLM agent: Gemini classification of unique masked texts (sentiment, act, empathy, resolution, topic, product) in bounded, resumable batches with a content-hash cache and honest coverage reporting; scripted-SDK tested; not run live (credential blocked).</w:t>
+        <w:t>Indexing: 4-turn chunks (overlap 2) from the 3,000 conversations, embedded twice (MiniLM 384-d semantic, LSA 192-d lexical) in FAISS with metadata filters.</w:t>
       </w:r>
     </w:p>
     <w:p>
       <w:pPr>
-        <w:pStyle w:val="ListBullet"/>
+        <w:pStyle w:val="ListBullet2"/>
       </w:pPr>
       <w:r>
-        <w:t>Memory: session store of resolved intent, scope, plan and deterministic references; follow-ups such as 'compare the top two', 'previous month', 'the first one', 'why ranked first', 'which findings are uncertain'. Follow-up routing on the evaluation sessions: 100%.</w:t>
+        <w:t>Triggers: similar-case questions; coaching evidence (in parallel); examples for the top leadership or negative-topic result (after the analysis, filtered to it).</w:t>
+      </w:r>
+    </w:p>
+    <w:p>
+      <w:pPr>
+        <w:pStyle w:val="ListBullet2"/>
+      </w:pPr>
+      <w:r>
+        <w:t>Evidence: one passage per conversation with message IDs, turn range, CSV line references and each method's rank.</w:t>
+      </w:r>
+    </w:p>
+    <w:p>
+      <w:pPr>
+        <w:pStyle w:val="ListBullet2"/>
+      </w:pPr>
+      <w:r>
+        <w:t>How it improves answers: it attaches real, on-topic transcripts to the computed result, and answers similar-case questions that analytics cannot. Retrieval never produces numbers. Answer quality with and without retrieval was not measured.</w:t>
+      </w:r>
+    </w:p>
+    <w:p>
+      <w:pPr>
+        <w:pStyle w:val="ListBullet2"/>
+      </w:pPr>
+      <w:r>
+        <w:t>Evaluation (36 paraphrased queries): topic precision@5 62.8% hybrid vs 62.2% MiniLM, 28.9% LSA, 12.5% random; hit@5 86.1%. The fusion weight was tuned on the same queries.</w:t>
+      </w:r>
+    </w:p>
+    <w:p>
+      <w:r>
+        <w:rPr>
+          <w:b/>
+        </w:rPr>
+        <w:t>Specialised LLM agent (intent classification):</w:t>
+      </w:r>
+    </w:p>
+    <w:p>
+      <w:pPr>
+        <w:pStyle w:val="ListBullet2"/>
+      </w:pPr>
+      <w:r>
+        <w:t>What it is: a local Qwen2.5-1.5B-Instruct model (llama.cpp, free, CPU) used as a constrained classifier. It returns one intent category from a closed list (JSON-schema grammar), with definitions and 15 hard examples in the prompt.</w:t>
+      </w:r>
+    </w:p>
+    <w:p>
+      <w:pPr>
+        <w:pStyle w:val="ListBullet2"/>
+      </w:pPr>
+      <w:r>
+        <w:t>Why chosen: a hosted model was unavailable (Gemini key blocked, no Groq key). Classification of questions, not generation of facts, is where a small model is safe, because every entity and number still comes from deterministic code.</w:t>
+      </w:r>
+    </w:p>
+    <w:p>
+      <w:pPr>
+        <w:pStyle w:val="ListBullet2"/>
+      </w:pPr>
+      <w:r>
+        <w:t>How it fits: the router calls it only when rules and semantic matching cannot route a question with high precision (6.9% of test questions).</w:t>
+      </w:r>
+    </w:p>
+    <w:p>
+      <w:pPr>
+        <w:pStyle w:val="ListBullet2"/>
+      </w:pPr>
+      <w:r>
+        <w:t>Usefulness, on the held-out test split scored once: router with the model 95.9% vs 90.4% without it, and 61.6% for the previous router. The model alone scores 58.9%, which is why it is a fallback, not the primary path.</w:t>
+      </w:r>
+    </w:p>
+    <w:p>
+      <w:pPr>
+        <w:pStyle w:val="ListBullet2"/>
+      </w:pPr>
+      <w:r>
+        <w:t>Also implemented but not run live: a Gemini batch labeller for message sentiment, act, empathy and resolution (scripted-SDK tested).</w:t>
+      </w:r>
+    </w:p>
+    <w:p>
+      <w:r>
+        <w:rPr>
+          <w:b/>
+        </w:rPr>
+        <w:t>Memory:</w:t>
+      </w:r>
+    </w:p>
+    <w:p>
+      <w:pPr>
+        <w:pStyle w:val="ListBullet2"/>
+      </w:pPr>
+      <w:r>
+        <w:t>Stored per turn in SQLite: question, resolved intent, scope, plan and deterministic references (ranked keys, conversation IDs).</w:t>
+      </w:r>
+    </w:p>
+    <w:p>
+      <w:pPr>
+        <w:pStyle w:val="ListBullet2"/>
+      </w:pPr>
+      <w:r>
+        <w:t>Retrieved: the last N turns are loaded at the start of each request.</w:t>
+      </w:r>
+    </w:p>
+    <w:p>
+      <w:pPr>
+        <w:pStyle w:val="ListBullet2"/>
+      </w:pPr>
+      <w:r>
+        <w:t>Effect: follow-ups such as 'compare the top two', 'previous month', 'the first one', 'why ranked first' are resolved from stored references, re-validated against the database, and the stored plan is re-run on current data. Follow-up routing on the evaluation sessions: 100%.</w:t>
+      </w:r>
+    </w:p>
+    <w:p>
+      <w:pPr>
+        <w:pStyle w:val="ListBullet2"/>
+      </w:pPr>
+      <w:r>
+        <w:t>Reliability and privacy: model prose is never reused as fact; sessions are isolated; questions are kept as typed (not PII-masked) for SESSION_RETENTION_DAYS (30) and can be deleted per session.</w:t>
       </w:r>
     </w:p>
     <w:p>
@@ -622,7 +750,7 @@
           </w:tcPr>
           <w:p>
             <w:r>
-              <w:t>62.2%</w:t>
+              <w:t>62.8%</w:t>
             </w:r>
           </w:p>
         </w:tc>
@@ -644,7 +772,7 @@
           </w:tcPr>
           <w:p>
             <w:r>
-              <w:t>133 / 560 ms</w:t>
+              <w:t>125 / 540 ms</w:t>
             </w:r>
           </w:p>
         </w:tc>
@@ -666,7 +794,7 @@
           </w:tcPr>
           <w:p>
             <w:r>
-              <w:t>97 backend · 8 Vitest · 10 Playwright — passing</w:t>
+              <w:t>138 backend · 8 Vitest · 17 Playwright — passing</w:t>
             </w:r>
           </w:p>
         </w:tc>
@@ -675,7 +803,7 @@
     <w:p/>
     <w:p>
       <w:r>
-        <w:t>Gemini could not be evaluated live: the development environment's credential returned 401 API_KEY_SERVICE_BLOCKED. End-to-end results above are for the deterministic path; intent routing was also measured with the local Qwen2.5-1.5B model (docs/evaluation/INTENT_ROUTING.md).</w:t>
+        <w:t>End-to-end results are for the default AUTO path, where the four assignment questions need no model. Intent routing was measured with the local Qwen2.5-1.5B model (docs/evaluation/INTENT_ROUTING.md). Hosted models (Gemini, Groq) were not evaluated live: the Gemini credential in the development environment returned 401 API_KEY_SERVICE_BLOCKED and no Groq key was available.</w:t>
       </w:r>
     </w:p>
     <w:p>

</xml_diff>